<commit_message>
version 2; tau eddited.
</commit_message>
<xml_diff>
--- a/lab-1/lab-1.docx
+++ b/lab-1/lab-1.docx
@@ -593,38 +593,26 @@
       <w:pPr>
         <w:rPr>
           <w:noProof/>
-        </w:rPr>
-      </w:pPr>
-    </w:p>
-    <w:p>
-      <w:pPr>
-        <w:rPr>
-          <w:noProof/>
-        </w:rPr>
-      </w:pPr>
-    </w:p>
-    <w:p>
-      <w:pPr>
-        <w:rPr>
-          <w:noProof/>
-        </w:rPr>
-      </w:pPr>
-    </w:p>
-    <w:p>
-      <w:pPr>
+          <w:sz w:val="36"/>
+          <w:szCs w:val="36"/>
+        </w:rPr>
+      </w:pPr>
+      <w:r>
         <w:rPr>
           <w:noProof/>
           <w:sz w:val="36"/>
           <w:szCs w:val="36"/>
         </w:rPr>
-      </w:pPr>
+        <w:lastRenderedPageBreak/>
+        <w:t xml:space="preserve">Ниже приведены </w:t>
+      </w:r>
       <w:r>
         <w:rPr>
           <w:noProof/>
           <w:sz w:val="36"/>
           <w:szCs w:val="36"/>
         </w:rPr>
-        <w:t xml:space="preserve">Ниже приведены </w:t>
+        <w:t>графики</w:t>
       </w:r>
       <w:r>
         <w:rPr>
@@ -632,7 +620,7 @@
           <w:sz w:val="36"/>
           <w:szCs w:val="36"/>
         </w:rPr>
-        <w:t>графики</w:t>
+        <w:t xml:space="preserve">, </w:t>
       </w:r>
       <w:r>
         <w:rPr>
@@ -640,7 +628,7 @@
           <w:sz w:val="36"/>
           <w:szCs w:val="36"/>
         </w:rPr>
-        <w:t xml:space="preserve">, </w:t>
+        <w:t>получившиеся в результате работы программы</w:t>
       </w:r>
       <w:r>
         <w:rPr>
@@ -648,14 +636,6 @@
           <w:sz w:val="36"/>
           <w:szCs w:val="36"/>
         </w:rPr>
-        <w:t>получившиеся в результате работы программы</w:t>
-      </w:r>
-      <w:r>
-        <w:rPr>
-          <w:noProof/>
-          <w:sz w:val="36"/>
-          <w:szCs w:val="36"/>
-        </w:rPr>
         <w:t>:</w:t>
       </w:r>
     </w:p>
@@ -669,13 +649,12 @@
       </w:pPr>
       <w:r>
         <w:rPr>
-          <w:noProof/>
           <w:lang w:val="en-US"/>
         </w:rPr>
         <w:drawing>
-          <wp:inline distT="0" distB="0" distL="0" distR="0" wp14:anchorId="0F7E94AD" wp14:editId="277B0939">
-            <wp:extent cx="5940425" cy="3164205"/>
-            <wp:effectExtent l="0" t="0" r="3175" b="0"/>
+          <wp:inline distT="0" distB="0" distL="0" distR="0" wp14:anchorId="65C2B427" wp14:editId="14A0D65C">
+            <wp:extent cx="5940425" cy="3118485"/>
+            <wp:effectExtent l="0" t="0" r="3175" b="5715"/>
             <wp:docPr id="1" name="Рисунок 1"/>
             <wp:cNvGraphicFramePr>
               <a:graphicFrameLocks xmlns:a="http://schemas.openxmlformats.org/drawingml/2006/main" noChangeAspect="1"/>
@@ -696,7 +675,7 @@
                   <pic:spPr>
                     <a:xfrm>
                       <a:off x="0" y="0"/>
-                      <a:ext cx="5940425" cy="3164205"/>
+                      <a:ext cx="5940425" cy="3118485"/>
                     </a:xfrm>
                     <a:prstGeom prst="rect">
                       <a:avLst/>
@@ -708,16 +687,43 @@
           </wp:inline>
         </w:drawing>
       </w:r>
-      <w:r>
-        <w:rPr>
-          <w:noProof/>
+    </w:p>
+    <w:p>
+      <w:pPr>
+        <w:rPr>
+          <w:lang w:val="en-US"/>
+        </w:rPr>
+      </w:pPr>
+    </w:p>
+    <w:p>
+      <w:pPr>
+        <w:rPr>
+          <w:lang w:val="en-US"/>
+        </w:rPr>
+      </w:pPr>
+    </w:p>
+    <w:p>
+      <w:pPr>
+        <w:rPr>
+          <w:lang w:val="en-US"/>
+        </w:rPr>
+      </w:pPr>
+    </w:p>
+    <w:p>
+      <w:pPr>
+        <w:rPr>
+          <w:lang w:val="en-US"/>
+        </w:rPr>
+      </w:pPr>
+      <w:r>
+        <w:rPr>
           <w:lang w:val="en-US"/>
         </w:rPr>
         <w:drawing>
-          <wp:inline distT="0" distB="0" distL="0" distR="0" wp14:anchorId="09CC3C4F" wp14:editId="3B2BB2E3">
-            <wp:extent cx="5940425" cy="3162935"/>
-            <wp:effectExtent l="0" t="0" r="3175" b="0"/>
-            <wp:docPr id="3" name="Рисунок 3"/>
+          <wp:inline distT="0" distB="0" distL="0" distR="0" wp14:anchorId="110A991F" wp14:editId="1CA6961A">
+            <wp:extent cx="5940425" cy="3116580"/>
+            <wp:effectExtent l="0" t="0" r="3175" b="7620"/>
+            <wp:docPr id="7" name="Рисунок 7"/>
             <wp:cNvGraphicFramePr>
               <a:graphicFrameLocks xmlns:a="http://schemas.openxmlformats.org/drawingml/2006/main" noChangeAspect="1"/>
             </wp:cNvGraphicFramePr>
@@ -737,7 +743,7 @@
                   <pic:spPr>
                     <a:xfrm>
                       <a:off x="0" y="0"/>
-                      <a:ext cx="5940425" cy="3162935"/>
+                      <a:ext cx="5940425" cy="3116580"/>
                     </a:xfrm>
                     <a:prstGeom prst="rect">
                       <a:avLst/>
@@ -765,15 +771,14 @@
       </w:pPr>
       <w:r>
         <w:rPr>
-          <w:noProof/>
           <w:lang w:val="en-US"/>
         </w:rPr>
         <w:lastRenderedPageBreak/>
         <w:drawing>
-          <wp:inline distT="0" distB="0" distL="0" distR="0" wp14:anchorId="5C0A7B38" wp14:editId="5A22B79E">
-            <wp:extent cx="5940425" cy="3164205"/>
-            <wp:effectExtent l="0" t="0" r="3175" b="0"/>
-            <wp:docPr id="4" name="Рисунок 4"/>
+          <wp:inline distT="0" distB="0" distL="0" distR="0" wp14:anchorId="27B4BFBC" wp14:editId="7E2BD787">
+            <wp:extent cx="5940425" cy="3115945"/>
+            <wp:effectExtent l="0" t="0" r="3175" b="8255"/>
+            <wp:docPr id="8" name="Рисунок 8"/>
             <wp:cNvGraphicFramePr>
               <a:graphicFrameLocks xmlns:a="http://schemas.openxmlformats.org/drawingml/2006/main" noChangeAspect="1"/>
             </wp:cNvGraphicFramePr>
@@ -793,7 +798,7 @@
                   <pic:spPr>
                     <a:xfrm>
                       <a:off x="0" y="0"/>
-                      <a:ext cx="5940425" cy="3164205"/>
+                      <a:ext cx="5940425" cy="3115945"/>
                     </a:xfrm>
                     <a:prstGeom prst="rect">
                       <a:avLst/>
@@ -805,27 +810,6 @@
           </wp:inline>
         </w:drawing>
       </w:r>
-    </w:p>
-    <w:p>
-      <w:pPr>
-        <w:rPr>
-          <w:lang w:val="en-US"/>
-        </w:rPr>
-      </w:pPr>
-    </w:p>
-    <w:p>
-      <w:pPr>
-        <w:rPr>
-          <w:lang w:val="en-US"/>
-        </w:rPr>
-      </w:pPr>
-    </w:p>
-    <w:p>
-      <w:pPr>
-        <w:rPr>
-          <w:lang w:val="en-US"/>
-        </w:rPr>
-      </w:pPr>
     </w:p>
     <w:p>
       <w:pPr>
@@ -919,6 +903,8 @@
     </w:p>
     <w:p/>
     <w:p/>
+    <w:p/>
+    <w:p/>
     <w:p>
       <w:pPr>
         <w:rPr>
@@ -931,6 +917,7 @@
           <w:sz w:val="36"/>
           <w:szCs w:val="36"/>
         </w:rPr>
+        <w:lastRenderedPageBreak/>
         <w:t>Второй вариант программы:</w:t>
       </w:r>
     </w:p>
@@ -942,13 +929,13 @@
       </w:pPr>
       <w:r>
         <w:rPr>
-          <w:noProof/>
+          <w:lang w:val="en-US"/>
         </w:rPr>
         <w:drawing>
-          <wp:inline distT="0" distB="0" distL="0" distR="0" wp14:anchorId="7F6ED7F4" wp14:editId="705374CE">
-            <wp:extent cx="6294120" cy="3342511"/>
-            <wp:effectExtent l="0" t="0" r="0" b="0"/>
-            <wp:docPr id="6" name="Рисунок 6"/>
+          <wp:inline distT="0" distB="0" distL="0" distR="0" wp14:anchorId="184F4994" wp14:editId="37B89923">
+            <wp:extent cx="6342515" cy="2834640"/>
+            <wp:effectExtent l="0" t="0" r="1270" b="3810"/>
+            <wp:docPr id="9" name="Рисунок 9"/>
             <wp:cNvGraphicFramePr>
               <a:graphicFrameLocks xmlns:a="http://schemas.openxmlformats.org/drawingml/2006/main" noChangeAspect="1"/>
             </wp:cNvGraphicFramePr>
@@ -959,27 +946,20 @@
                     <pic:cNvPr id="1" name=""/>
                     <pic:cNvPicPr/>
                   </pic:nvPicPr>
-                  <pic:blipFill rotWithShape="1">
+                  <pic:blipFill>
                     <a:blip r:embed="rId8"/>
-                    <a:srcRect b="5587"/>
-                    <a:stretch/>
+                    <a:stretch>
+                      <a:fillRect/>
+                    </a:stretch>
                   </pic:blipFill>
-                  <pic:spPr bwMode="auto">
+                  <pic:spPr>
                     <a:xfrm>
                       <a:off x="0" y="0"/>
-                      <a:ext cx="6298115" cy="3344632"/>
+                      <a:ext cx="6348630" cy="2837373"/>
                     </a:xfrm>
                     <a:prstGeom prst="rect">
                       <a:avLst/>
                     </a:prstGeom>
-                    <a:ln>
-                      <a:noFill/>
-                    </a:ln>
-                    <a:extLst>
-                      <a:ext uri="{53640926-AAD7-44D8-BBD7-CCE9431645EC}">
-                        <a14:shadowObscured xmlns:a14="http://schemas.microsoft.com/office/drawing/2010/main"/>
-                      </a:ext>
-                    </a:extLst>
                   </pic:spPr>
                 </pic:pic>
               </a:graphicData>
@@ -987,15 +967,45 @@
           </wp:inline>
         </w:drawing>
       </w:r>
-      <w:r>
-        <w:rPr>
-          <w:noProof/>
+    </w:p>
+    <w:p>
+      <w:pPr>
+        <w:rPr>
+          <w:sz w:val="36"/>
+          <w:szCs w:val="36"/>
+        </w:rPr>
+      </w:pPr>
+    </w:p>
+    <w:p>
+      <w:pPr>
+        <w:rPr>
+          <w:sz w:val="36"/>
+          <w:szCs w:val="36"/>
+        </w:rPr>
+      </w:pPr>
+      <w:r>
+        <w:rPr>
+          <w:sz w:val="36"/>
+          <w:szCs w:val="36"/>
+        </w:rPr>
+        <w:t>Один участок в приближении:</w:t>
+      </w:r>
+    </w:p>
+    <w:p>
+      <w:pPr>
+        <w:rPr>
+          <w:lang w:val="en-US"/>
+        </w:rPr>
+      </w:pPr>
+      <w:r>
+        <w:rPr>
+          <w:lang w:val="en-US"/>
         </w:rPr>
         <w:drawing>
-          <wp:inline distT="0" distB="0" distL="0" distR="0" wp14:anchorId="5511EAA6" wp14:editId="503A53A6">
-            <wp:extent cx="6283968" cy="3345180"/>
-            <wp:effectExtent l="0" t="0" r="2540" b="7620"/>
-            <wp:docPr id="5" name="Рисунок 5"/>
+          <wp:inline distT="0" distB="0" distL="0" distR="0" wp14:anchorId="2B64A411" wp14:editId="59114E12">
+            <wp:extent cx="6416854" cy="2865120"/>
+            <wp:effectExtent l="0" t="0" r="3175" b="0"/>
+            <wp:docPr id="10" name="Рисунок 10"/>
             <wp:cNvGraphicFramePr>
               <a:graphicFrameLocks xmlns:a="http://schemas.openxmlformats.org/drawingml/2006/main" noChangeAspect="1"/>
             </wp:cNvGraphicFramePr>
@@ -1006,27 +1016,20 @@
                     <pic:cNvPr id="1" name=""/>
                     <pic:cNvPicPr/>
                   </pic:nvPicPr>
-                  <pic:blipFill rotWithShape="1">
+                  <pic:blipFill>
                     <a:blip r:embed="rId9"/>
-                    <a:srcRect b="5359"/>
-                    <a:stretch/>
+                    <a:stretch>
+                      <a:fillRect/>
+                    </a:stretch>
                   </pic:blipFill>
-                  <pic:spPr bwMode="auto">
+                  <pic:spPr>
                     <a:xfrm>
                       <a:off x="0" y="0"/>
-                      <a:ext cx="6286555" cy="3346557"/>
+                      <a:ext cx="6424361" cy="2868472"/>
                     </a:xfrm>
                     <a:prstGeom prst="rect">
                       <a:avLst/>
                     </a:prstGeom>
-                    <a:ln>
-                      <a:noFill/>
-                    </a:ln>
-                    <a:extLst>
-                      <a:ext uri="{53640926-AAD7-44D8-BBD7-CCE9431645EC}">
-                        <a14:shadowObscured xmlns:a14="http://schemas.microsoft.com/office/drawing/2010/main"/>
-                      </a:ext>
-                    </a:extLst>
                   </pic:spPr>
                 </pic:pic>
               </a:graphicData>
@@ -1076,6 +1079,15 @@
           <w:lang w:val="en-US"/>
         </w:rPr>
       </w:pPr>
+    </w:p>
+    <w:p>
+      <w:pPr>
+        <w:rPr>
+          <w:lang w:val="en-US"/>
+        </w:rPr>
+      </w:pPr>
+      <w:bookmarkStart w:id="0" w:name="_GoBack"/>
+      <w:bookmarkEnd w:id="0"/>
     </w:p>
     <w:p>
       <w:pPr>
@@ -1289,15 +1301,7 @@
       </w:hyperlink>
     </w:p>
     <w:p/>
-    <w:p>
-      <w:pPr>
-        <w:rPr>
-          <w:lang w:val="en-US"/>
-        </w:rPr>
-      </w:pPr>
-      <w:bookmarkStart w:id="0" w:name="_GoBack"/>
-      <w:bookmarkEnd w:id="0"/>
-    </w:p>
+    <w:p/>
     <w:sectPr>
       <w:pgSz w:w="11906" w:h="16838"/>
       <w:pgMar w:top="1134" w:right="850" w:bottom="1134" w:left="1701" w:header="708" w:footer="708" w:gutter="0"/>

</xml_diff>